<commit_message>
docs: update Fase 0 downloads — Founder Makiese Vicente roster
Co-authored-by: EduardoZ121 <EduardoZ121@users.noreply.github.com>
</commit_message>
<xml_diff>
--- a/downloads/kuteka-fase0/KUTEKA_FASE0_DELIVERY_CHECKLIST_2026-08-28.docx
+++ b/downloads/kuteka-fase0/KUTEKA_FASE0_DELIVERY_CHECKLIST_2026-08-28.docx
@@ -1502,7 +1502,7 @@
           </w:tcPr>
           <w:p>
             <w:r>
-              <w:t>PR merge oficial</w:t>
+              <w:t>PR merge repo oficial</w:t>
             </w:r>
           </w:p>
         </w:tc>
@@ -1512,7 +1512,7 @@
           </w:tcPr>
           <w:p>
             <w:r>
-              <w:t>🔒 Eduardo</w:t>
+              <w:t>🔒 Co-Founder (Eduardo — acesso GitHub) + validação Founder</w:t>
             </w:r>
           </w:p>
         </w:tc>
@@ -1651,7 +1651,7 @@
           </w:tcPr>
           <w:p>
             <w:r>
-              <w:t>Founder</w:t>
+              <w:t>**Founder**</w:t>
             </w:r>
           </w:p>
         </w:tc>
@@ -1660,7 +1660,9 @@
             <w:tcW w:type="dxa" w:w="2160"/>
           </w:tcPr>
           <w:p>
-            <w:r/>
+            <w:r>
+              <w:t>Makiese Vicente</w:t>
+            </w:r>
           </w:p>
         </w:tc>
         <w:tc>
@@ -1689,7 +1691,7 @@
           </w:tcPr>
           <w:p>
             <w:r>
-              <w:t>Co-Founder</w:t>
+              <w:t>**Co-Founder**</w:t>
             </w:r>
           </w:p>
         </w:tc>
@@ -1698,7 +1700,9 @@
             <w:tcW w:type="dxa" w:w="2160"/>
           </w:tcPr>
           <w:p>
-            <w:r/>
+            <w:r>
+              <w:t>Eduardo</w:t>
+            </w:r>
           </w:p>
         </w:tc>
         <w:tc>

</xml_diff>